<commit_message>
Address independent review: qualify fine-tuning result, correct Ruigrok, farm-first per-class change
- Abstract, highlights, conclusion, cover letter: fine-tuning result stated for the recipe tested;
  retraining gain only claimed for ~50 images (5-10: no measurable difference).
- Ruigrok et al. (2023): fine-tuning on as few as 25 images reduced the error (was: ~90% with ~300).
- Beery contrast and schedule-robustness wording corrected; Table S7 caption lists schedule differences.
- Per-class calibration change averaged within farm first; Table 6 labels the whole-half row.
- Methods: first 10 modules' weights and BN statistics frozen (Ultralytics 8.4.138 behaviour),
  about 300 steps, buffer wording; limitations add single random partition and single FT recipe.

Co-Authored-By: Claude Opus 5.5 <noreply@anthropic.com>
Claude-Session: https://claude.ai/code/session_01MKk9JY43DLLC2GkbFX456R
</commit_message>
<xml_diff>
--- a/paper/cover_letter.docx
+++ b/paper/cover_letter.docx
@@ -90,7 +90,7 @@
         <w:pStyle w:val="Compact"/>
       </w:pPr>
       <w:r>
-        <w:t xml:space="preserve">In 168 training runs with training length held constant, more farms and more images per farm raised unseen-farm accuracy by similar amounts (0.039 and 0.030 mAP50 per doubling); part of the value of a farm lay in the classes it carried.</w:t>
+        <w:t xml:space="preserve">In 168 training runs with training length held constant, more farms and more images per farm both raised unseen-farm accuracy, by amounts that could not be distinguished (0.039 and 0.030 mAP50 per doubling); part of the value of a farm lay in the classes it carried.</w:t>
       </w:r>
     </w:p>
     <w:p>
@@ -102,7 +102,7 @@
         <w:pStyle w:val="Compact"/>
       </w:pPr>
       <w:r>
-        <w:t xml:space="preserve">Fine-tuning a trained detector on a few images from a new farm made it worse on that farm; adding the same images to the training set and retraining improved it. For devices that meet new farms, this is a direct, practical recommendation.</w:t>
+        <w:t xml:space="preserve">With the fine-tuning recipe tested, fine-tuning a trained detector on a few images from a new farm made it worse on that farm, whereas adding about 50 such images to the training set and retraining improved it; a new farm’s images are better used as additional training data.</w:t>
       </w:r>
     </w:p>
     <w:p>

</xml_diff>

<commit_message>
Final cross-check and proofreading fixes
</commit_message>
<xml_diff>
--- a/paper/cover_letter.docx
+++ b/paper/cover_letter.docx
@@ -54,7 +54,7 @@
         <w:pStyle w:val="BodyText"/>
       </w:pPr>
       <w:r>
-        <w:t xml:space="preserve">Detectors for crop diseases and pests are commonly evaluated on a random split of images from the farms they were trained on, while the growers who use them farm elsewhere. Using 827 annotated images from eight commercial durian farms in Peninsular Malaysia, each tagged with its farm, and 281 from two orchards in Sabah, the manuscript measures what that difference costs, how a data-collection budget should be spent to reduce it, and how much a few images from a new farm recover. Its main findings are:</w:t>
+        <w:t xml:space="preserve">Detectors for crop diseases and pests are often evaluated on a random split of images from the farms they were trained on, while the growers who use them farm elsewhere. Using 827 annotated images from eight commercial durian farms in Peninsular Malaysia, each tagged with its farm, and 281 from two orchards in Sabah, the manuscript measures what that difference costs, how a data-collection budget should be spent to reduce it, and how much a few images from a new farm recover. Its main findings are:</w:t>
       </w:r>
     </w:p>
     <w:p>
@@ -66,7 +66,7 @@
         <w:pStyle w:val="Compact"/>
       </w:pPr>
       <w:r>
-        <w:t xml:space="preserve">With each held-out farm excluded from training, early stopping and checkpoint selection, six detectors from three architecture families scored 1.6–2.3 times lower mAP50 on unseen farms than on a random split. The held-out farm, not the detector, determined most of the score: averaged over the same farms, no two detectors differed by more than 0.022 mAP50.</w:t>
+        <w:t xml:space="preserve">With each held-out farm excluded from training, early stopping and checkpoint selection, six detectors scored 1.6–2.3 times higher mAP50 on a random split than on unseen farms. The held-out farm determined far more of the score than the detector: averaged over the same farms, no two detectors differed by more than 0.022 mAP50.</w:t>
       </w:r>
     </w:p>
     <w:p>
@@ -102,7 +102,7 @@
         <w:pStyle w:val="Compact"/>
       </w:pPr>
       <w:r>
-        <w:t xml:space="preserve">With the fine-tuning recipe tested, fine-tuning a trained detector on a few images from a new farm made it worse on that farm, whereas adding about 50 such images to the training set and retraining improved it; a new farm’s images are better used as additional training data.</w:t>
+        <w:t xml:space="preserve">With the fine-tuning recipe tested, fine-tuning a trained detector on a few images from a new farm made it worse on that farm, whereas adding about 50 such images to the training set and retraining improved it. With this recipe, a new farm’s images are better used as additional training data.</w:t>
       </w:r>
     </w:p>
     <w:p>
@@ -134,7 +134,7 @@
         <w:pStyle w:val="BodyText"/>
       </w:pPr>
       <w:r>
-        <w:t xml:space="preserve">The images, annotations, farm identifiers and split manifests are deposited on Zenodo, and the code, result tables and a script that recomputes every number in the manuscript are public on GitHub.</w:t>
+        <w:t xml:space="preserve">The images and annotations are deposited on Zenodo; the farm identifiers, split manifests, code, result tables and a script that recomputes every number in the manuscript are public on GitHub.</w:t>
       </w:r>
     </w:p>
     <w:p>
@@ -142,7 +142,7 @@
         <w:pStyle w:val="BodyText"/>
       </w:pPr>
       <w:r>
-        <w:t xml:space="preserve">The peninsular images derive from the same collection as a separate manuscript on capture-session leakage in image classification, which is under review elsewhere and differs in task, unit, annotation and analysis; this is described in the manuscript. The leave-one-farm-out runs reported in Sections 3.1–3.3 were also analysed, together with three non-agricultural datasets, in a broader methodological manuscript that I withdrew from another journal before review; the present manuscript replaces it for the durian results and is not under consideration elsewhere. I am developing a handheld decision-support device for durian growers, and this interest is declared in the manuscript.</w:t>
+        <w:t xml:space="preserve">The peninsular images derive from the same collection as a separate manuscript on capture-session leakage in image classification, which is under review elsewhere. That manuscript classifies whole images and treats the capture session as the unit; the present one detects individual lesions and insects, treats the farm as the unit, and adds the data-budget and new-farm experiments. The relation is described in the manuscript. The leave-one-farm-out runs reported in Sections 3.1–3.3 were also analysed, together with three non-agricultural datasets, in a broader methodological manuscript that I withdrew from another journal before review; the present manuscript replaces it for the durian results and is not under consideration elsewhere. I am developing a handheld decision-support device for durian growers, and this interest is declared in the manuscript.</w:t>
       </w:r>
     </w:p>
     <w:p>

</xml_diff>

<commit_message>
Add prospective test on the Seremban farm; revised manuscript
</commit_message>
<xml_diff>
--- a/paper/cover_letter.docx
+++ b/paper/cover_letter.docx
@@ -33,7 +33,7 @@
         <w:t xml:space="preserve"> </w:t>
       </w:r>
       <w:r>
-        <w:t xml:space="preserve">for consideration as an Original Research Paper in</w:t>
+        <w:t xml:space="preserve">for consideration as an original research article in</w:t>
       </w:r>
       <w:r>
         <w:t xml:space="preserve"> </w:t>
@@ -43,7 +43,7 @@
           <w:iCs/>
           <w:i/>
         </w:rPr>
-        <w:t xml:space="preserve">Computers and Electronics in Agriculture</w:t>
+        <w:t xml:space="preserve">[JOURNAL]</w:t>
       </w:r>
       <w:r>
         <w:t xml:space="preserve">.</w:t>
@@ -54,7 +54,7 @@
         <w:pStyle w:val="BodyText"/>
       </w:pPr>
       <w:r>
-        <w:t xml:space="preserve">Detectors for crop diseases and pests are often evaluated on a random split of images from the farms they were trained on, while the growers who use them farm elsewhere. Using 827 annotated images from eight commercial durian farms in Peninsular Malaysia, each tagged with its farm, and 281 from two orchards in Sabah, the manuscript measures what that difference costs, how a data-collection budget should be spent to reduce it, and how much a few images from a new farm recover. Its main findings are:</w:t>
+        <w:t xml:space="preserve">Detectors for crop diseases and pests are usually evaluated on a random split of images from the farms they were trained on, while the growers who use them farm elsewhere. Using 827 lesion-annotated images from eight commercial durian farms in Peninsular Malaysia, each tagged with its farm, and 281 from two orchards in Sabah, the manuscript measures what that difference costs, how a data-collection budget should be spent to reduce it, and how a few labelled images from a new farm should be used. It then tests the farm-level figures prospectively on a ninth farm photographed after the analyses were complete. Its main findings are:</w:t>
       </w:r>
     </w:p>
     <w:p>
@@ -66,7 +66,7 @@
         <w:pStyle w:val="Compact"/>
       </w:pPr>
       <w:r>
-        <w:t xml:space="preserve">With each held-out farm excluded from training, early stopping and checkpoint selection, six detectors scored 1.6–2.3 times higher mAP50 on a random split than on unseen farms. The held-out farm determined far more of the score than the detector: averaged over the same farms, no two detectors differed by more than 0.022 mAP50.</w:t>
+        <w:t xml:space="preserve">With each held-out farm excluded from training, early stopping and checkpoint selection, six detectors from three architecture families scored 1.6–2.3 times higher mAP50 on a random split than on unseen farms. The held-out farm determined far more of the score than the detector: averaged over the same farms, no two detectors differed by more than 0.022 mAP50, whereas farms spanned 0.094–0.356.</w:t>
       </w:r>
     </w:p>
     <w:p>
@@ -78,7 +78,7 @@
         <w:pStyle w:val="Compact"/>
       </w:pPr>
       <w:r>
-        <w:t xml:space="preserve">Psyllid and psyllid damage transferred worst, retaining 25–30% of their random-split AP on unseen farms, and size alone does not explain it.</w:t>
+        <w:t xml:space="preserve">Psyllid and psyllid damage transferred worst, retaining 25–30% of their random-split AP on unseen farms.</w:t>
       </w:r>
     </w:p>
     <w:p>
@@ -102,7 +102,19 @@
         <w:pStyle w:val="Compact"/>
       </w:pPr>
       <w:r>
-        <w:t xml:space="preserve">With the fine-tuning recipe tested, fine-tuning a trained detector on a few images from a new farm made it worse on that farm, whereas adding about 50 such images to the training set and retraining improved it. With this recipe, a new farm’s images are better used as additional training data.</w:t>
+        <w:t xml:space="preserve">With the fine-tuning recipe tested, fine-tuning a trained detector on a few images from a new farm made it worse on that farm, whereas adding about 50 such images to the training set and retraining improved it.</w:t>
+      </w:r>
+    </w:p>
+    <w:p>
+      <w:pPr>
+        <w:numPr>
+          <w:ilvl w:val="0"/>
+          <w:numId w:val="1001"/>
+        </w:numPr>
+        <w:pStyle w:val="Compact"/>
+      </w:pPr>
+      <w:r>
+        <w:t xml:space="preserve">On the ninth farm, scored with the frozen models against four predictions whose thresholds, together with the hashes of every model and test image, were locked before scoring, all four predictions held: the deployed detector scored 0.298 mAP50, inside the held-out-farm range and far below its random-split figure of 0.428.</w:t>
       </w:r>
     </w:p>
     <w:p>
@@ -110,7 +122,15 @@
         <w:pStyle w:val="FirstParagraph"/>
       </w:pPr>
       <w:r>
-        <w:t xml:space="preserve">The work extends to orchard disease and pest detection a question this journal has published for weed detection in arable fields (Ruigrok et al., 2023,</w:t>
+        <w:t xml:space="preserve">[FIT PARAGRAPH — keep one:]</w:t>
+      </w:r>
+    </w:p>
+    <w:p>
+      <w:pPr>
+        <w:pStyle w:val="BodyText"/>
+      </w:pPr>
+      <w:r>
+        <w:t xml:space="preserve">[CEA] The work extends to orchard disease and pest detection a question this journal has published for weed detection in arable fields (Ruigrok et al., 2023,</w:t>
       </w:r>
       <w:r>
         <w:t xml:space="preserve"> </w:t>
@@ -126,7 +146,23 @@
         <w:t xml:space="preserve"> </w:t>
       </w:r>
       <w:r>
-        <w:t xml:space="preserve">204, 107554), and it gives practitioners direct recommendations for evaluation and for planning collection campaigns.</w:t>
+        <w:t xml:space="preserve">204, 107554) and for dataset size and variety in plant disease classification (Barbedo, 2018,</w:t>
+      </w:r>
+      <w:r>
+        <w:t xml:space="preserve"> </w:t>
+      </w:r>
+      <w:r>
+        <w:rPr>
+          <w:iCs/>
+          <w:i/>
+        </w:rPr>
+        <w:t xml:space="preserve">Comput. Electron. Agric.</w:t>
+      </w:r>
+      <w:r>
+        <w:t xml:space="preserve"> </w:t>
+      </w:r>
+      <w:r>
+        <w:t xml:space="preserve">153, 46–53), and it gives practitioners direct recommendations for evaluation and for planning collection campaigns.</w:t>
       </w:r>
     </w:p>
     <w:p>
@@ -134,7 +170,23 @@
         <w:pStyle w:val="BodyText"/>
       </w:pPr>
       <w:r>
-        <w:t xml:space="preserve">The images and annotations are deposited on Zenodo; the farm identifiers, split manifests, code, result tables and a script that recomputes every number in the manuscript are public on GitHub.</w:t>
+        <w:t xml:space="preserve">[Plant Phenomics] The work asks for lesion-level disease and pest detection in orchards the question that Andvaag et al. (2024,</w:t>
+      </w:r>
+      <w:r>
+        <w:t xml:space="preserve"> </w:t>
+      </w:r>
+      <w:r>
+        <w:rPr>
+          <w:iCs/>
+          <w:i/>
+        </w:rPr>
+        <w:t xml:space="preserve">Plant Phenomics</w:t>
+      </w:r>
+      <w:r>
+        <w:t xml:space="preserve"> </w:t>
+      </w:r>
+      <w:r>
+        <w:t xml:space="preserve">6, 0268) asked for aerial plant counting, whether training-set diversity or size governs generalisation to new fields, and it adds a preregistered prospective test of the kind that, to my knowledge, has not been reported for a crop-phenotyping detector.</w:t>
       </w:r>
     </w:p>
     <w:p>
@@ -142,7 +194,7 @@
         <w:pStyle w:val="BodyText"/>
       </w:pPr>
       <w:r>
-        <w:t xml:space="preserve">The peninsular images derive from the same collection as a separate manuscript on capture-session leakage in image classification, which is under review elsewhere. That manuscript classifies whole images and treats the capture session as the unit; the present one detects individual lesions and insects, treats the farm as the unit, and adds the data-budget and new-farm experiments. The relation is described in the manuscript. The leave-one-farm-out runs reported in Sections 3.1–3.3 were also analysed, together with three non-agricultural datasets, in a broader methodological manuscript that I withdrew from another journal before review; the present manuscript replaces it for the durian results and is not under consideration elsewhere. I am developing a handheld decision-support device for durian growers, and this interest is declared in the manuscript.</w:t>
+        <w:t xml:space="preserve">[AIIA] The work is a data-centric study of a deployed machine-vision system: it measures how evaluation design, training-data composition and new-farm adaptation each change what a grower will experience, and closes with a preregistered prospective test. It fits the journal’s scope in machine vision, precision agriculture and decision support.</w:t>
       </w:r>
     </w:p>
     <w:p>
@@ -150,6 +202,22 @@
         <w:pStyle w:val="BodyText"/>
       </w:pPr>
       <w:r>
+        <w:t xml:space="preserve">The images and annotations are deposited on Zenodo (https://doi.org/10.5281/zenodo.22030623); the farm identifiers, split manifests, code, result tables, the lock file of the prospective test and a script that recomputes every number in the manuscript are public on GitHub (https://github.com/xiaolin200206/durian-site-split).</w:t>
+      </w:r>
+    </w:p>
+    <w:p>
+      <w:pPr>
+        <w:pStyle w:val="BodyText"/>
+      </w:pPr>
+      <w:r>
+        <w:t xml:space="preserve">The peninsular images derive from the same collection as a separate manuscript on capture-session leakage in image classification, which is under review elsewhere. That manuscript classifies whole images and treats the capture session as the unit; the present one detects individual lesions and insects, treats the farm as the unit, and adds the data-budget, new-farm and prospective experiments. The leave-one-farm-out runs reported in Sections 3.1–3.3 were also analysed, together with three non-agricultural datasets, in a broader methodological manuscript that I withdrew from another journal before review; the present manuscript replaces it for the durian results and is not under consideration elsewhere. I am an independent researcher without institutional or grant funding; I am developing a handheld decision-support device for durian growers, and this interest is declared in the manuscript.</w:t>
+      </w:r>
+    </w:p>
+    <w:p>
+      <w:pPr>
+        <w:pStyle w:val="BodyText"/>
+      </w:pPr>
+      <w:r>
         <w:t xml:space="preserve">Thank you for considering this submission.</w:t>
       </w:r>
     </w:p>
@@ -172,22 +240,41 @@
         <w:t xml:space="preserve"> </w:t>
       </w:r>
       <w:r>
-        <w:t xml:space="preserve">Faculty of Computer Science (Data Science), UCSI University, Kuala Lumpur, Malaysia</w:t>
+        <w:t xml:space="preserve">Independent researcher, Kuala Lumpur, Malaysia</w:t>
       </w:r>
       <w:r>
         <w:t xml:space="preserve"> </w:t>
       </w:r>
       <w:r>
-        <w:t xml:space="preserve">1002475487@ucsiuniversity.edu.my · ORCID 0009-0009-6031-8479</w:t>
-      </w:r>
-    </w:p>
-    <w:sectPr/>
+        <w:t xml:space="preserve">lim20020725@gmail.com · ORCID 0009-0009-6031-8479</w:t>
+      </w:r>
+    </w:p>
+    <w:sectPr>
+      <w:footerReference r:id="rId9" w:type="default"/>
+      <w:lnNumType w:countBy="1" w:restart="continuous"/>
+    </w:sectPr>
   </w:body>
 </w:document>
 </file>
 
 <file path=word/comments.xml><?xml version="1.0" encoding="utf-8"?>
 <w:comments xmlns:w="http://schemas.openxmlformats.org/wordprocessingml/2006/main" xmlns:m="http://schemas.openxmlformats.org/officeDocument/2006/math" xmlns:r="http://schemas.openxmlformats.org/officeDocument/2006/relationships" xmlns:o="urn:schemas-microsoft-com:office:office" xmlns:v="urn:schemas-microsoft-com:vml" xmlns:w10="urn:schemas-microsoft-com:office:word" xmlns:a="http://schemas.openxmlformats.org/drawingml/2006/main" xmlns:pic="http://schemas.openxmlformats.org/drawingml/2006/picture" xmlns:wp="http://schemas.openxmlformats.org/drawingml/2006/wordprocessingDrawing"/>
+</file>
+
+<file path=word/footer1.xml><?xml version="1.0" encoding="utf-8"?>
+<w:ftr xmlns:m="http://schemas.openxmlformats.org/officeDocument/2006/math" xmlns:mc="http://schemas.openxmlformats.org/markup-compatibility/2006" xmlns:mo="http://schemas.microsoft.com/office/mac/office/2008/main" xmlns:mv="urn:schemas-microsoft-com:mac:vml" xmlns:o="urn:schemas-microsoft-com:office:office" xmlns:r="http://schemas.openxmlformats.org/officeDocument/2006/relationships" xmlns:v="urn:schemas-microsoft-com:vml" xmlns:w10="urn:schemas-microsoft-com:office:word" xmlns:w14="http://schemas.microsoft.com/office/word/2010/wordml" xmlns:w="http://schemas.openxmlformats.org/wordprocessingml/2006/main" xmlns:wne="http://schemas.microsoft.com/office/word/2006/wordml" xmlns:wp14="http://schemas.microsoft.com/office/word/2010/wordprocessingDrawing" xmlns:wp="http://schemas.openxmlformats.org/drawingml/2006/wordprocessingDrawing" xmlns:wpc="http://schemas.microsoft.com/office/word/2010/wordprocessingCanvas" xmlns:wpg="http://schemas.microsoft.com/office/word/2010/wordprocessingGroup" xmlns:wpi="http://schemas.microsoft.com/office/word/2010/wordprocessingInk" xmlns:wps="http://schemas.microsoft.com/office/word/2010/wordprocessingShape" mc:Ignorable="w14 wp14">
+  <w:p>
+    <w:pPr>
+      <w:pStyle w:val="Footer"/>
+      <w:jc w:val="center"/>
+    </w:pPr>
+    <w:r>
+      <w:fldChar w:fldCharType="begin"/>
+      <w:instrText xml:space="preserve">PAGE</w:instrText>
+      <w:fldChar w:fldCharType="end"/>
+    </w:r>
+  </w:p>
+</w:ftr>
 </file>
 
 <file path=word/footnotes.xml><?xml version="1.0" encoding="utf-8"?>
@@ -393,29 +480,51 @@
   <w:style w:default="1" w:styleId="Normal" w:type="paragraph">
     <w:name w:val="Normal"/>
     <w:qFormat/>
+    <w:pPr>
+      <w:spacing w:line="360" w:lineRule="auto"/>
+    </w:pPr>
+    <w:rPr>
+      <w:rFonts w:ascii="Times New Roman" w:cs="Times New Roman" w:eastAsia="Times New Roman" w:hAnsi="Times New Roman"/>
+      <w:sz w:val="24"/>
+    </w:rPr>
   </w:style>
   <w:style w:styleId="BodyText" w:type="paragraph">
     <w:name w:val="Body Text"/>
     <w:basedOn w:val="Normal"/>
     <w:link w:val="BodyTextChar"/>
     <w:pPr>
-      <w:spacing w:after="180" w:before="180"/>
-    </w:pPr>
-    <w:qFormat/>
+      <w:spacing w:after="180" w:before="180" w:line="360" w:lineRule="auto"/>
+    </w:pPr>
+    <w:qFormat/>
+    <w:rPr>
+      <w:rFonts w:ascii="Times New Roman" w:cs="Times New Roman" w:eastAsia="Times New Roman" w:hAnsi="Times New Roman"/>
+      <w:sz w:val="24"/>
+    </w:rPr>
   </w:style>
   <w:style w:customStyle="1" w:styleId="FirstParagraph" w:type="paragraph">
     <w:name w:val="First Paragraph"/>
     <w:basedOn w:val="BodyText"/>
     <w:next w:val="BodyText"/>
     <w:qFormat/>
+    <w:pPr>
+      <w:spacing w:line="360" w:lineRule="auto"/>
+    </w:pPr>
+    <w:rPr>
+      <w:rFonts w:ascii="Times New Roman" w:cs="Times New Roman" w:eastAsia="Times New Roman" w:hAnsi="Times New Roman"/>
+      <w:sz w:val="24"/>
+    </w:rPr>
   </w:style>
   <w:style w:customStyle="1" w:styleId="Compact" w:type="paragraph">
     <w:name w:val="Compact"/>
     <w:basedOn w:val="BodyText"/>
     <w:qFormat/>
     <w:pPr>
-      <w:spacing w:after="36" w:before="36"/>
-    </w:pPr>
+      <w:spacing w:after="36" w:before="36" w:line="240" w:lineRule="auto"/>
+    </w:pPr>
+    <w:rPr>
+      <w:rFonts w:ascii="Times New Roman" w:cs="Times New Roman" w:eastAsia="Times New Roman" w:hAnsi="Times New Roman"/>
+      <w:sz w:val="20"/>
+    </w:rPr>
   </w:style>
   <w:style w:styleId="Title" w:type="paragraph">
     <w:name w:val="Title"/>
@@ -429,7 +538,7 @@
       <w:jc w:val="center"/>
     </w:pPr>
     <w:rPr>
-      <w:rFonts w:asciiTheme="majorHAnsi" w:cstheme="majorBidi" w:eastAsiaTheme="majorEastAsia" w:hAnsiTheme="majorHAnsi"/>
+      <w:rFonts w:ascii="Times New Roman" w:asciiTheme="majorHAnsi" w:cs="Times New Roman" w:cstheme="majorBidi" w:eastAsia="Times New Roman" w:eastAsiaTheme="majorEastAsia" w:hAnsi="Times New Roman" w:hAnsiTheme="majorHAnsi"/>
       <w:b/>
       <w:bCs/>
       <w:color w:themeColor="accent1" w:themeShade="B5" w:val="345A8A"/>
@@ -449,6 +558,7 @@
       <w:jc w:val="center"/>
     </w:pPr>
     <w:rPr>
+      <w:rFonts w:ascii="Times New Roman" w:cs="Times New Roman" w:eastAsia="Times New Roman" w:hAnsi="Times New Roman"/>
       <w:sz w:val="30"/>
       <w:szCs w:val="30"/>
     </w:rPr>
@@ -462,6 +572,9 @@
       <w:keepLines/>
       <w:jc w:val="center"/>
     </w:pPr>
+    <w:rPr>
+      <w:rFonts w:ascii="Times New Roman" w:cs="Times New Roman" w:eastAsia="Times New Roman" w:hAnsi="Times New Roman"/>
+    </w:rPr>
   </w:style>
   <w:style w:styleId="Date" w:type="paragraph">
     <w:name w:val="Date"/>
@@ -472,6 +585,9 @@
       <w:keepLines/>
       <w:jc w:val="center"/>
     </w:pPr>
+    <w:rPr>
+      <w:rFonts w:ascii="Times New Roman" w:cs="Times New Roman" w:eastAsia="Times New Roman" w:hAnsi="Times New Roman"/>
+    </w:rPr>
   </w:style>
   <w:style w:customStyle="1" w:styleId="AbstractTitle" w:type="paragraph">
     <w:name w:val="Abstract Title"/>
@@ -487,6 +603,7 @@
     <w:rPr>
       <w:sz w:val="20"/>
       <w:szCs w:val="20"/>
+      <w:rFonts w:ascii="Times New Roman" w:cs="Times New Roman" w:eastAsia="Times New Roman" w:hAnsi="Times New Roman"/>
       <w:b/>
       <w:color w:val="345A8A"/>
       &gt;
@@ -503,6 +620,7 @@
       <w:spacing w:after="300" w:before="100"/>
     </w:pPr>
     <w:rPr>
+      <w:rFonts w:ascii="Times New Roman" w:cs="Times New Roman" w:eastAsia="Times New Roman" w:hAnsi="Times New Roman"/>
       <w:sz w:val="20"/>
       <w:szCs w:val="20"/>
     </w:rPr>
@@ -513,7 +631,9 @@
     <w:next w:val="Bibliography"/>
     <w:qFormat/>
     <w:pPr/>
-    <w:rPr/>
+    <w:rPr>
+      <w:rFonts w:ascii="Times New Roman" w:cs="Times New Roman" w:eastAsia="Times New Roman" w:hAnsi="Times New Roman"/>
+    </w:rPr>
   </w:style>
   <w:style w:styleId="Heading1" w:type="paragraph">
     <w:name w:val="Heading 1"/>
@@ -528,7 +648,7 @@
       <w:outlineLvl w:val="0"/>
     </w:pPr>
     <w:rPr>
-      <w:rFonts w:asciiTheme="majorHAnsi" w:cstheme="majorBidi" w:eastAsiaTheme="majorEastAsia" w:hAnsiTheme="majorHAnsi"/>
+      <w:rFonts w:ascii="Times New Roman" w:asciiTheme="majorHAnsi" w:cs="Times New Roman" w:cstheme="majorBidi" w:eastAsia="Times New Roman" w:eastAsiaTheme="majorEastAsia" w:hAnsi="Times New Roman" w:hAnsiTheme="majorHAnsi"/>
       <w:b/>
       <w:bCs/>
       <w:color w:themeColor="accent1" w:val="4F81BD"/>
@@ -550,7 +670,7 @@
       <w:outlineLvl w:val="1"/>
     </w:pPr>
     <w:rPr>
-      <w:rFonts w:asciiTheme="majorHAnsi" w:cstheme="majorBidi" w:eastAsiaTheme="majorEastAsia" w:hAnsiTheme="majorHAnsi"/>
+      <w:rFonts w:ascii="Times New Roman" w:asciiTheme="majorHAnsi" w:cs="Times New Roman" w:cstheme="majorBidi" w:eastAsia="Times New Roman" w:eastAsiaTheme="majorEastAsia" w:hAnsi="Times New Roman" w:hAnsiTheme="majorHAnsi"/>
       <w:b/>
       <w:bCs/>
       <w:color w:themeColor="accent1" w:val="4F81BD"/>
@@ -572,7 +692,7 @@
       <w:outlineLvl w:val="2"/>
     </w:pPr>
     <w:rPr>
-      <w:rFonts w:asciiTheme="majorHAnsi" w:cstheme="majorBidi" w:eastAsiaTheme="majorEastAsia" w:hAnsiTheme="majorHAnsi"/>
+      <w:rFonts w:ascii="Times New Roman" w:asciiTheme="majorHAnsi" w:cs="Times New Roman" w:cstheme="majorBidi" w:eastAsia="Times New Roman" w:eastAsiaTheme="majorEastAsia" w:hAnsi="Times New Roman" w:hAnsiTheme="majorHAnsi"/>
       <w:b/>
       <w:bCs/>
       <w:color w:themeColor="accent1" w:val="4F81BD"/>
@@ -594,7 +714,7 @@
       <w:outlineLvl w:val="3"/>
     </w:pPr>
     <w:rPr>
-      <w:rFonts w:asciiTheme="majorHAnsi" w:cstheme="majorBidi" w:eastAsiaTheme="majorEastAsia" w:hAnsiTheme="majorHAnsi"/>
+      <w:rFonts w:ascii="Times New Roman" w:asciiTheme="majorHAnsi" w:cs="Times New Roman" w:cstheme="majorBidi" w:eastAsia="Times New Roman" w:eastAsiaTheme="majorEastAsia" w:hAnsi="Times New Roman" w:hAnsiTheme="majorHAnsi"/>
       <w:i/>
       <w:bCs/>
       <w:color w:themeColor="accent1" w:val="4F81BD"/>
@@ -616,7 +736,7 @@
       <w:outlineLvl w:val="4"/>
     </w:pPr>
     <w:rPr>
-      <w:rFonts w:asciiTheme="majorHAnsi" w:cstheme="majorBidi" w:eastAsiaTheme="majorEastAsia" w:hAnsiTheme="majorHAnsi"/>
+      <w:rFonts w:ascii="Times New Roman" w:asciiTheme="majorHAnsi" w:cs="Times New Roman" w:cstheme="majorBidi" w:eastAsia="Times New Roman" w:eastAsiaTheme="majorEastAsia" w:hAnsi="Times New Roman" w:hAnsiTheme="majorHAnsi"/>
       <w:iCs/>
       <w:color w:themeColor="accent1" w:val="4F81BD"/>
       <w:sz w:val="24"/>
@@ -637,7 +757,7 @@
       <w:outlineLvl w:val="5"/>
     </w:pPr>
     <w:rPr>
-      <w:rFonts w:asciiTheme="majorHAnsi" w:cstheme="majorBidi" w:eastAsiaTheme="majorEastAsia" w:hAnsiTheme="majorHAnsi"/>
+      <w:rFonts w:ascii="Times New Roman" w:asciiTheme="majorHAnsi" w:cs="Times New Roman" w:cstheme="majorBidi" w:eastAsia="Times New Roman" w:eastAsiaTheme="majorEastAsia" w:hAnsi="Times New Roman" w:hAnsiTheme="majorHAnsi"/>
       <w:color w:themeColor="accent1" w:val="4F81BD"/>
       <w:sz w:val="24"/>
       <w:szCs w:val="24"/>
@@ -657,7 +777,7 @@
       <w:outlineLvl w:val="6"/>
     </w:pPr>
     <w:rPr>
-      <w:rFonts w:asciiTheme="majorHAnsi" w:cstheme="majorBidi" w:eastAsiaTheme="majorEastAsia" w:hAnsiTheme="majorHAnsi"/>
+      <w:rFonts w:ascii="Times New Roman" w:asciiTheme="majorHAnsi" w:cs="Times New Roman" w:cstheme="majorBidi" w:eastAsia="Times New Roman" w:eastAsiaTheme="majorEastAsia" w:hAnsi="Times New Roman" w:hAnsiTheme="majorHAnsi"/>
       <w:color w:themeColor="accent1" w:val="4F81BD"/>
       <w:sz w:val="24"/>
       <w:szCs w:val="24"/>
@@ -677,7 +797,7 @@
       <w:outlineLvl w:val="7"/>
     </w:pPr>
     <w:rPr>
-      <w:rFonts w:asciiTheme="majorHAnsi" w:cstheme="majorBidi" w:eastAsiaTheme="majorEastAsia" w:hAnsiTheme="majorHAnsi"/>
+      <w:rFonts w:ascii="Times New Roman" w:asciiTheme="majorHAnsi" w:cs="Times New Roman" w:cstheme="majorBidi" w:eastAsia="Times New Roman" w:eastAsiaTheme="majorEastAsia" w:hAnsi="Times New Roman" w:hAnsiTheme="majorHAnsi"/>
       <w:color w:themeColor="accent1" w:val="4F81BD"/>
       <w:sz w:val="24"/>
       <w:szCs w:val="24"/>
@@ -697,7 +817,7 @@
       <w:outlineLvl w:val="8"/>
     </w:pPr>
     <w:rPr>
-      <w:rFonts w:asciiTheme="majorHAnsi" w:cstheme="majorBidi" w:eastAsiaTheme="majorEastAsia" w:hAnsiTheme="majorHAnsi"/>
+      <w:rFonts w:ascii="Times New Roman" w:asciiTheme="majorHAnsi" w:cs="Times New Roman" w:cstheme="majorBidi" w:eastAsia="Times New Roman" w:eastAsiaTheme="majorEastAsia" w:hAnsi="Times New Roman" w:hAnsiTheme="majorHAnsi"/>
       <w:color w:themeColor="accent1" w:val="4F81BD"/>
       <w:sz w:val="24"/>
       <w:szCs w:val="24"/>
@@ -714,6 +834,9 @@
       <w:spacing w:after="100" w:before="100"/>
       <w:ind w:firstLine="0" w:left="480" w:right="480"/>
     </w:pPr>
+    <w:rPr>
+      <w:rFonts w:ascii="Times New Roman" w:cs="Times New Roman" w:eastAsia="Times New Roman" w:hAnsi="Times New Roman"/>
+    </w:rPr>
   </w:style>
   <w:style w:styleId="FootnoteText" w:type="paragraph">
     <w:name w:val="Footnote Text"/>
@@ -722,6 +845,9 @@
     <w:uiPriority w:val="9"/>
     <w:unhideWhenUsed/>
     <w:qFormat/>
+    <w:rPr>
+      <w:rFonts w:ascii="Times New Roman" w:cs="Times New Roman" w:eastAsia="Times New Roman" w:hAnsi="Times New Roman"/>
+    </w:rPr>
   </w:style>
   <w:style w:default="1" w:styleId="DefaultParagraphFont" w:type="character">
     <w:name w:val="Default Paragraph Font"/>
@@ -769,12 +895,16 @@
       <w:spacing w:after="0"/>
     </w:pPr>
     <w:rPr>
+      <w:rFonts w:ascii="Times New Roman" w:cs="Times New Roman" w:eastAsia="Times New Roman" w:hAnsi="Times New Roman"/>
       <w:b/>
     </w:rPr>
   </w:style>
   <w:style w:customStyle="1" w:styleId="Definition" w:type="paragraph">
     <w:name w:val="Definition"/>
     <w:basedOn w:val="Normal"/>
+    <w:rPr>
+      <w:rFonts w:ascii="Times New Roman" w:cs="Times New Roman" w:eastAsia="Times New Roman" w:hAnsi="Times New Roman"/>
+    </w:rPr>
   </w:style>
   <w:style w:styleId="Caption" w:type="paragraph">
     <w:name w:val="Caption"/>
@@ -784,6 +914,7 @@
       <w:spacing w:after="120" w:before="0"/>
     </w:pPr>
     <w:rPr>
+      <w:rFonts w:ascii="Times New Roman" w:cs="Times New Roman" w:eastAsia="Times New Roman" w:hAnsi="Times New Roman"/>
       <w:i/>
     </w:rPr>
   </w:style>
@@ -793,14 +924,23 @@
     <w:pPr>
       <w:keepNext/>
     </w:pPr>
+    <w:rPr>
+      <w:rFonts w:ascii="Times New Roman" w:cs="Times New Roman" w:eastAsia="Times New Roman" w:hAnsi="Times New Roman"/>
+    </w:rPr>
   </w:style>
   <w:style w:customStyle="1" w:styleId="ImageCaption" w:type="paragraph">
     <w:name w:val="Image Caption"/>
     <w:basedOn w:val="Caption"/>
+    <w:rPr>
+      <w:rFonts w:ascii="Times New Roman" w:cs="Times New Roman" w:eastAsia="Times New Roman" w:hAnsi="Times New Roman"/>
+    </w:rPr>
   </w:style>
   <w:style w:customStyle="1" w:styleId="Figure" w:type="paragraph">
     <w:name w:val="Figure"/>
     <w:basedOn w:val="Normal"/>
+    <w:rPr>
+      <w:rFonts w:ascii="Times New Roman" w:cs="Times New Roman" w:eastAsia="Times New Roman" w:hAnsi="Times New Roman"/>
+    </w:rPr>
   </w:style>
   <w:style w:customStyle="1" w:styleId="CaptionedFigure" w:type="paragraph">
     <w:name w:val="Captioned Figure"/>
@@ -808,6 +948,9 @@
     <w:pPr>
       <w:keepNext/>
     </w:pPr>
+    <w:rPr>
+      <w:rFonts w:ascii="Times New Roman" w:cs="Times New Roman" w:eastAsia="Times New Roman" w:hAnsi="Times New Roman"/>
+    </w:rPr>
   </w:style>
   <w:style w:customStyle="1" w:styleId="BodyTextChar" w:type="character">
     <w:name w:val="Body Text Char"/>
@@ -852,21 +995,24 @@
       <w:outlineLvl w:val="9"/>
     </w:pPr>
     <w:rPr>
-      <w:rFonts w:asciiTheme="majorHAnsi" w:cstheme="majorBidi" w:eastAsiaTheme="majorEastAsia" w:hAnsiTheme="majorHAnsi"/>
+      <w:rFonts w:ascii="Times New Roman" w:asciiTheme="majorHAnsi" w:cs="Times New Roman" w:cstheme="majorBidi" w:eastAsia="Times New Roman" w:eastAsiaTheme="majorEastAsia" w:hAnsi="Times New Roman" w:hAnsiTheme="majorHAnsi"/>
       <w:b w:val="0"/>
       <w:bCs w:val="0"/>
       <w:color w:themeColor="accent1" w:themeShade="BF" w:val="365F91"/>
     </w:rPr>
   </w:style>
-  <w:style w:type="paragraph" w:customStyle="1" w:styleId="SourceCode">
+  <w:style w:customStyle="1" w:styleId="SourceCode" w:type="paragraph">
     <w:name w:val="Source Code"/>
     <w:basedOn w:val="Normal"/>
     <w:link w:val="VerbatimChar"/>
     <w:pPr>
       <w:wordWrap w:val="off"/>
     </w:pPr>
-  </w:style>
-  <w:style w:type="character" w:customStyle="1" w:styleId="KeywordTok">
+    <w:rPr>
+      <w:rFonts w:ascii="Times New Roman" w:cs="Times New Roman" w:eastAsia="Times New Roman" w:hAnsi="Times New Roman"/>
+    </w:rPr>
+  </w:style>
+  <w:style w:customStyle="1" w:styleId="KeywordTok" w:type="character">
     <w:name w:val="KeywordTok"/>
     <w:basedOn w:val="VerbatimChar"/>
     <w:rPr>
@@ -874,77 +1020,77 @@
       <w:b/>
     </w:rPr>
   </w:style>
-  <w:style w:type="character" w:customStyle="1" w:styleId="DataTypeTok">
+  <w:style w:customStyle="1" w:styleId="DataTypeTok" w:type="character">
     <w:name w:val="DataTypeTok"/>
     <w:basedOn w:val="VerbatimChar"/>
     <w:rPr>
       <w:color w:val="902000"/>
     </w:rPr>
   </w:style>
-  <w:style w:type="character" w:customStyle="1" w:styleId="DecValTok">
+  <w:style w:customStyle="1" w:styleId="DecValTok" w:type="character">
     <w:name w:val="DecValTok"/>
     <w:basedOn w:val="VerbatimChar"/>
     <w:rPr>
       <w:color w:val="40a070"/>
     </w:rPr>
   </w:style>
-  <w:style w:type="character" w:customStyle="1" w:styleId="BaseNTok">
+  <w:style w:customStyle="1" w:styleId="BaseNTok" w:type="character">
     <w:name w:val="BaseNTok"/>
     <w:basedOn w:val="VerbatimChar"/>
     <w:rPr>
       <w:color w:val="40a070"/>
     </w:rPr>
   </w:style>
-  <w:style w:type="character" w:customStyle="1" w:styleId="FloatTok">
+  <w:style w:customStyle="1" w:styleId="FloatTok" w:type="character">
     <w:name w:val="FloatTok"/>
     <w:basedOn w:val="VerbatimChar"/>
     <w:rPr>
       <w:color w:val="40a070"/>
     </w:rPr>
   </w:style>
-  <w:style w:type="character" w:customStyle="1" w:styleId="ConstantTok">
+  <w:style w:customStyle="1" w:styleId="ConstantTok" w:type="character">
     <w:name w:val="ConstantTok"/>
     <w:basedOn w:val="VerbatimChar"/>
     <w:rPr>
       <w:color w:val="880000"/>
     </w:rPr>
   </w:style>
-  <w:style w:type="character" w:customStyle="1" w:styleId="CharTok">
+  <w:style w:customStyle="1" w:styleId="CharTok" w:type="character">
     <w:name w:val="CharTok"/>
     <w:basedOn w:val="VerbatimChar"/>
     <w:rPr>
       <w:color w:val="4070a0"/>
     </w:rPr>
   </w:style>
-  <w:style w:type="character" w:customStyle="1" w:styleId="SpecialCharTok">
+  <w:style w:customStyle="1" w:styleId="SpecialCharTok" w:type="character">
     <w:name w:val="SpecialCharTok"/>
     <w:basedOn w:val="VerbatimChar"/>
     <w:rPr>
       <w:color w:val="4070a0"/>
     </w:rPr>
   </w:style>
-  <w:style w:type="character" w:customStyle="1" w:styleId="StringTok">
+  <w:style w:customStyle="1" w:styleId="StringTok" w:type="character">
     <w:name w:val="StringTok"/>
     <w:basedOn w:val="VerbatimChar"/>
     <w:rPr>
       <w:color w:val="4070a0"/>
     </w:rPr>
   </w:style>
-  <w:style w:type="character" w:customStyle="1" w:styleId="VerbatimStringTok">
+  <w:style w:customStyle="1" w:styleId="VerbatimStringTok" w:type="character">
     <w:name w:val="VerbatimStringTok"/>
     <w:basedOn w:val="VerbatimChar"/>
     <w:rPr>
       <w:color w:val="4070a0"/>
     </w:rPr>
   </w:style>
-  <w:style w:type="character" w:customStyle="1" w:styleId="SpecialStringTok">
+  <w:style w:customStyle="1" w:styleId="SpecialStringTok" w:type="character">
     <w:name w:val="SpecialStringTok"/>
     <w:basedOn w:val="VerbatimChar"/>
     <w:rPr>
       <w:color w:val="bb6688"/>
     </w:rPr>
   </w:style>
-  <w:style w:type="character" w:customStyle="1" w:styleId="ImportTok">
+  <w:style w:customStyle="1" w:styleId="ImportTok" w:type="character">
     <w:name w:val="ImportTok"/>
     <w:basedOn w:val="VerbatimChar"/>
     <w:rPr>
@@ -952,7 +1098,7 @@
       <w:b/>
     </w:rPr>
   </w:style>
-  <w:style w:type="character" w:customStyle="1" w:styleId="CommentTok">
+  <w:style w:customStyle="1" w:styleId="CommentTok" w:type="character">
     <w:name w:val="CommentTok"/>
     <w:basedOn w:val="VerbatimChar"/>
     <w:rPr>
@@ -960,7 +1106,7 @@
       <w:i/>
     </w:rPr>
   </w:style>
-  <w:style w:type="character" w:customStyle="1" w:styleId="DocumentationTok">
+  <w:style w:customStyle="1" w:styleId="DocumentationTok" w:type="character">
     <w:name w:val="DocumentationTok"/>
     <w:basedOn w:val="VerbatimChar"/>
     <w:rPr>
@@ -968,7 +1114,7 @@
       <w:i/>
     </w:rPr>
   </w:style>
-  <w:style w:type="character" w:customStyle="1" w:styleId="AnnotationTok">
+  <w:style w:customStyle="1" w:styleId="AnnotationTok" w:type="character">
     <w:name w:val="AnnotationTok"/>
     <w:basedOn w:val="VerbatimChar"/>
     <w:rPr>
@@ -977,7 +1123,7 @@
       <w:i/>
     </w:rPr>
   </w:style>
-  <w:style w:type="character" w:customStyle="1" w:styleId="CommentVarTok">
+  <w:style w:customStyle="1" w:styleId="CommentVarTok" w:type="character">
     <w:name w:val="CommentVarTok"/>
     <w:basedOn w:val="VerbatimChar"/>
     <w:rPr>
@@ -986,28 +1132,28 @@
       <w:i/>
     </w:rPr>
   </w:style>
-  <w:style w:type="character" w:customStyle="1" w:styleId="OtherTok">
+  <w:style w:customStyle="1" w:styleId="OtherTok" w:type="character">
     <w:name w:val="OtherTok"/>
     <w:basedOn w:val="VerbatimChar"/>
     <w:rPr>
       <w:color w:val="007020"/>
     </w:rPr>
   </w:style>
-  <w:style w:type="character" w:customStyle="1" w:styleId="FunctionTok">
+  <w:style w:customStyle="1" w:styleId="FunctionTok" w:type="character">
     <w:name w:val="FunctionTok"/>
     <w:basedOn w:val="VerbatimChar"/>
     <w:rPr>
       <w:color w:val="06287e"/>
     </w:rPr>
   </w:style>
-  <w:style w:type="character" w:customStyle="1" w:styleId="VariableTok">
+  <w:style w:customStyle="1" w:styleId="VariableTok" w:type="character">
     <w:name w:val="VariableTok"/>
     <w:basedOn w:val="VerbatimChar"/>
     <w:rPr>
       <w:color w:val="19177c"/>
     </w:rPr>
   </w:style>
-  <w:style w:type="character" w:customStyle="1" w:styleId="ControlFlowTok">
+  <w:style w:customStyle="1" w:styleId="ControlFlowTok" w:type="character">
     <w:name w:val="ControlFlowTok"/>
     <w:basedOn w:val="VerbatimChar"/>
     <w:rPr>
@@ -1015,45 +1161,45 @@
       <w:b/>
     </w:rPr>
   </w:style>
-  <w:style w:type="character" w:customStyle="1" w:styleId="OperatorTok">
+  <w:style w:customStyle="1" w:styleId="OperatorTok" w:type="character">
     <w:name w:val="OperatorTok"/>
     <w:basedOn w:val="VerbatimChar"/>
     <w:rPr>
       <w:color w:val="666666"/>
     </w:rPr>
   </w:style>
-  <w:style w:type="character" w:customStyle="1" w:styleId="BuiltInTok">
+  <w:style w:customStyle="1" w:styleId="BuiltInTok" w:type="character">
     <w:name w:val="BuiltInTok"/>
     <w:basedOn w:val="VerbatimChar"/>
     <w:rPr>
       <w:color w:val="008000"/>
     </w:rPr>
   </w:style>
-  <w:style w:type="character" w:customStyle="1" w:styleId="ExtensionTok">
+  <w:style w:customStyle="1" w:styleId="ExtensionTok" w:type="character">
     <w:name w:val="ExtensionTok"/>
     <w:basedOn w:val="VerbatimChar"/>
     <w:rPr/>
   </w:style>
-  <w:style w:type="character" w:customStyle="1" w:styleId="PreprocessorTok">
+  <w:style w:customStyle="1" w:styleId="PreprocessorTok" w:type="character">
     <w:name w:val="PreprocessorTok"/>
     <w:basedOn w:val="VerbatimChar"/>
     <w:rPr>
       <w:color w:val="bc7a00"/>
     </w:rPr>
   </w:style>
-  <w:style w:type="character" w:customStyle="1" w:styleId="AttributeTok">
+  <w:style w:customStyle="1" w:styleId="AttributeTok" w:type="character">
     <w:name w:val="AttributeTok"/>
     <w:basedOn w:val="VerbatimChar"/>
     <w:rPr>
       <w:color w:val="7d9029"/>
     </w:rPr>
   </w:style>
-  <w:style w:type="character" w:customStyle="1" w:styleId="RegionMarkerTok">
+  <w:style w:customStyle="1" w:styleId="RegionMarkerTok" w:type="character">
     <w:name w:val="RegionMarkerTok"/>
     <w:basedOn w:val="VerbatimChar"/>
     <w:rPr/>
   </w:style>
-  <w:style w:type="character" w:customStyle="1" w:styleId="InformationTok">
+  <w:style w:customStyle="1" w:styleId="InformationTok" w:type="character">
     <w:name w:val="InformationTok"/>
     <w:basedOn w:val="VerbatimChar"/>
     <w:rPr>
@@ -1062,7 +1208,7 @@
       <w:i/>
     </w:rPr>
   </w:style>
-  <w:style w:type="character" w:customStyle="1" w:styleId="WarningTok">
+  <w:style w:customStyle="1" w:styleId="WarningTok" w:type="character">
     <w:name w:val="WarningTok"/>
     <w:basedOn w:val="VerbatimChar"/>
     <w:rPr>
@@ -1071,7 +1217,7 @@
       <w:i/>
     </w:rPr>
   </w:style>
-  <w:style w:type="character" w:customStyle="1" w:styleId="AlertTok">
+  <w:style w:customStyle="1" w:styleId="AlertTok" w:type="character">
     <w:name w:val="AlertTok"/>
     <w:basedOn w:val="VerbatimChar"/>
     <w:rPr>
@@ -1079,7 +1225,7 @@
       <w:b/>
     </w:rPr>
   </w:style>
-  <w:style w:type="character" w:customStyle="1" w:styleId="ErrorTok">
+  <w:style w:customStyle="1" w:styleId="ErrorTok" w:type="character">
     <w:name w:val="ErrorTok"/>
     <w:basedOn w:val="VerbatimChar"/>
     <w:rPr>
@@ -1087,7 +1233,7 @@
       <w:b/>
     </w:rPr>
   </w:style>
-  <w:style w:type="character" w:customStyle="1" w:styleId="NormalTok">
+  <w:style w:customStyle="1" w:styleId="NormalTok" w:type="character">
     <w:name w:val="NormalTok"/>
     <w:basedOn w:val="VerbatimChar"/>
     <w:rPr/>

</xml_diff>